<commit_message>
docs: update technical report with today's work
Adds the SDK move, the dual-keeper devnet run, the keeper crash fix, and the docs site deploy. Corrects section 19, which said the site was split into a separate repo -- it wasn't, it deployed straight from the main repo via Cloudflare Workers.
</commit_message>
<xml_diff>
--- a/Inertia_Protocol_Technical_Report.docx
+++ b/Inertia_Protocol_Technical_Report.docx
@@ -101,6 +101,20 @@
           <w:szCs w:val="18"/>
         </w:rPr>
         <w:t xml:space="preserve">Repository: github.com/Inertia-Protocol/inertia-protocol</w:t>
+      </w:r>
+    </w:p>
+    <w:p>
+      <w:pPr>
+        <w:jc w:val="center"/>
+      </w:pPr>
+      <w:r>
+        <w:rPr>
+          <w:rFonts w:ascii="Consolas" w:cs="Consolas" w:eastAsia="Consolas" w:hAnsi="Consolas"/>
+          <w:color w:val="6B7280"/>
+          <w:sz w:val="18"/>
+          <w:szCs w:val="18"/>
+        </w:rPr>
+        <w:t xml:space="preserve">Live site &amp; docs: https://inertia-protocol.odomushi-core.workers.dev/</w:t>
       </w:r>
     </w:p>
     <w:p>
@@ -1677,85 +1691,22 @@
           <w:szCs w:val="18"/>
         </w:rPr>
         <w:t xml:space="preserve">fn anti_snipe_required_tip(keeper_share: u64, slots_into_rescue: u64) -&gt; u64 {</w:t>
-      </w:r>
-      <w:r>
-        <w:rPr>
-          <w:rFonts w:ascii="Consolas" w:cs="Consolas" w:eastAsia="Consolas" w:hAnsi="Consolas"/>
-          <w:sz w:val="18"/>
-          <w:szCs w:val="18"/>
-        </w:rPr>
         <w:br/>
         <w:t xml:space="preserve">    let decay_progress = slots_into_rescue.saturating_sub(1);</w:t>
-      </w:r>
-      <w:r>
-        <w:rPr>
-          <w:rFonts w:ascii="Consolas" w:cs="Consolas" w:eastAsia="Consolas" w:hAnsi="Consolas"/>
-          <w:sz w:val="18"/>
-          <w:szCs w:val="18"/>
-        </w:rPr>
         <w:br/>
         <w:t xml:space="preserve">    if keeper_share &lt;= MIN_JITO_TIP_LAMPORTS || decay_progress &gt;= TIP_DECAY_SLOTS {</w:t>
-      </w:r>
-      <w:r>
-        <w:rPr>
-          <w:rFonts w:ascii="Consolas" w:cs="Consolas" w:eastAsia="Consolas" w:hAnsi="Consolas"/>
-          <w:sz w:val="18"/>
-          <w:szCs w:val="18"/>
-        </w:rPr>
         <w:br/>
         <w:t xml:space="preserve">        return MIN_JITO_TIP_LAMPORTS;</w:t>
-      </w:r>
-      <w:r>
-        <w:rPr>
-          <w:rFonts w:ascii="Consolas" w:cs="Consolas" w:eastAsia="Consolas" w:hAnsi="Consolas"/>
-          <w:sz w:val="18"/>
-          <w:szCs w:val="18"/>
-        </w:rPr>
         <w:br/>
         <w:t xml:space="preserve">    }</w:t>
-      </w:r>
-      <w:r>
-        <w:rPr>
-          <w:rFonts w:ascii="Consolas" w:cs="Consolas" w:eastAsia="Consolas" w:hAnsi="Consolas"/>
-          <w:sz w:val="18"/>
-          <w:szCs w:val="18"/>
-        </w:rPr>
         <w:br/>
         <w:t xml:space="preserve">    let remaining_slots = TIP_DECAY_SLOTS - decay_progress;</w:t>
-      </w:r>
-      <w:r>
-        <w:rPr>
-          <w:rFonts w:ascii="Consolas" w:cs="Consolas" w:eastAsia="Consolas" w:hAnsi="Consolas"/>
-          <w:sz w:val="18"/>
-          <w:szCs w:val="18"/>
-        </w:rPr>
         <w:br/>
         <w:t xml:space="preserve">    let extra_above_floor = keeper_share - MIN_JITO_TIP_LAMPORTS;</w:t>
-      </w:r>
-      <w:r>
-        <w:rPr>
-          <w:rFonts w:ascii="Consolas" w:cs="Consolas" w:eastAsia="Consolas" w:hAnsi="Consolas"/>
-          <w:sz w:val="18"/>
-          <w:szCs w:val="18"/>
-        </w:rPr>
         <w:br/>
         <w:t xml:space="preserve">    MIN_JITO_TIP_LAMPORTS</w:t>
-      </w:r>
-      <w:r>
-        <w:rPr>
-          <w:rFonts w:ascii="Consolas" w:cs="Consolas" w:eastAsia="Consolas" w:hAnsi="Consolas"/>
-          <w:sz w:val="18"/>
-          <w:szCs w:val="18"/>
-        </w:rPr>
         <w:br/>
         <w:t xml:space="preserve">        + extra_above_floor.saturating_mul(remaining_slots) / TIP_DECAY_SLOTS</w:t>
-      </w:r>
-      <w:r>
-        <w:rPr>
-          <w:rFonts w:ascii="Consolas" w:cs="Consolas" w:eastAsia="Consolas" w:hAnsi="Consolas"/>
-          <w:sz w:val="18"/>
-          <w:szCs w:val="18"/>
-        </w:rPr>
         <w:br/>
         <w:t xml:space="preserve">}</w:t>
       </w:r>
@@ -3625,6 +3576,184 @@
     </w:p>
     <w:p>
       <w:pPr>
+        <w:pStyle w:val="Heading3"/>
+        <w:spacing w:after="120" w:before="240"/>
+      </w:pPr>
+      <w:r>
+        <w:rPr>
+          <w:b/>
+          <w:bCs/>
+        </w:rPr>
+        <w:t xml:space="preserve">12.13 Day 9 (2026-08-04): the SDK move</w:t>
+      </w:r>
+    </w:p>
+    <w:p>
+      <w:pPr>
+        <w:spacing w:after="160" w:line="276"/>
+        <w:jc w:val="both"/>
+      </w:pPr>
+      <w:r>
+        <w:rPr>
+          <w:rFonts w:ascii="Calibri" w:cs="Calibri" w:eastAsia="Calibri" w:hAnsi="Calibri"/>
+          <w:sz w:val="22"/>
+          <w:szCs w:val="22"/>
+        </w:rPr>
+        <w:t xml:space="preserve">The three real DEX swap-builder clients — orcaSwap.ts, raydiumCpmmSwap.ts, and meteoraDlmmSwap.ts — moved from packages/keeper/src into packages/sdk/src and are now exported directly from the SDK's own index, so any integrating platform or independently operated keeper can use them without depending on this repository's reference keeper bot at all. bot.ts now imports OrcaSwapBuilder from @inertia-protocol/sdk rather than a local file, and packages/keeper's own dependency list was trimmed accordingly. Verified beyond a passing compile: both packages were rebuilt from a clean state and the live devnet keeper (Section 12.14) was restarted on the new build and continued producing real rescues immediately afterward, confirming the move didn't silently change behavior.</w:t>
+      </w:r>
+    </w:p>
+    <w:p>
+      <w:pPr>
+        <w:pStyle w:val="Heading3"/>
+        <w:spacing w:after="120" w:before="240"/>
+      </w:pPr>
+      <w:r>
+        <w:rPr>
+          <w:b/>
+          <w:bCs/>
+        </w:rPr>
+        <w:t xml:space="preserve">12.14 Day 9, continued: a live, continuous, dual-keeper devnet run</w:t>
+      </w:r>
+    </w:p>
+    <w:p>
+      <w:pPr>
+        <w:spacing w:after="160" w:line="276"/>
+        <w:jc w:val="both"/>
+      </w:pPr>
+      <w:r>
+        <w:rPr>
+          <w:rFonts w:ascii="Calibri" w:cs="Calibri" w:eastAsia="Calibri" w:hAnsi="Calibri"/>
+          <w:sz w:val="22"/>
+          <w:szCs w:val="22"/>
+        </w:rPr>
+        <w:t xml:space="preserve">Every proof up to this point involved a single keeper acting once. A materially different and stronger claim — that the protocol's permissionless race actually resolves safely and fairly under real concurrent competition, not just in isolated demonstration — required something this report had not yet produced: two independently-keyed keeper identities, each running the unmodified reference bot, watching and attempting to rescue the same live escrows in parallel, continuously, against a real activity generator posting a new stalled escrow against the same Orca pool roughly every 45 seconds.</w:t>
+      </w:r>
+    </w:p>
+    <w:p>
+      <w:pPr>
+        <w:spacing w:after="160" w:line="276"/>
+        <w:jc w:val="both"/>
+      </w:pPr>
+      <w:r>
+        <w:rPr>
+          <w:rFonts w:ascii="Calibri" w:cs="Calibri" w:eastAsia="Calibri" w:hAnsi="Calibri"/>
+          <w:sz w:val="22"/>
+          <w:szCs w:val="22"/>
+        </w:rPr>
+        <w:t xml:space="preserve">Race safety is unambiguous: across dozens of real, concurrent races, every single one resolved to exactly one clean RESCUED outcome, with the losing keeper's own code correctly detecting the escrow had already closed and reporting a lost-race outcome rather than sending a doomed transaction. Zero double-spends, zero stuck funds, across the entire run.</w:t>
+      </w:r>
+    </w:p>
+    <w:p>
+      <w:pPr>
+        <w:spacing w:after="160" w:line="276"/>
+        <w:jc w:val="both"/>
+      </w:pPr>
+      <w:r>
+        <w:rPr>
+          <w:rFonts w:ascii="Calibri" w:cs="Calibri" w:eastAsia="Calibri" w:hAnsi="Calibri"/>
+          <w:sz w:val="22"/>
+          <w:szCs w:val="22"/>
+        </w:rPr>
+        <w:t xml:space="preserve">Race fairness is a genuinely more nuanced result, reported honestly rather than rounded up. An early, small sample (7 races) skewed 6-1 toward one keeper identity, which on its own would be consistent with a deterministic clock-phase artifact between two identically configured, fixed-interval polling loops rather than real competitive parity. Over a much larger sample accumulated since, the distribution converged toward roughly even, which is real evidence against pure determinism but is not the same claim as having tested genuine keeper diversity — different operators, different infrastructure, different network latency — none of which this run, using two processes on the same machine against the same RPC, actually tested. Section 13 states this distinction explicitly rather than letting the safety result imply more than it proves.</w:t>
+      </w:r>
+    </w:p>
+    <w:p>
+      <w:pPr>
+        <w:pStyle w:val="Heading3"/>
+        <w:spacing w:after="120" w:before="240"/>
+      </w:pPr>
+      <w:r>
+        <w:rPr>
+          <w:b/>
+          <w:bCs/>
+        </w:rPr>
+        <w:t xml:space="preserve">12.15 Day 9, continued: a real crash found and fixed during the live run</w:t>
+      </w:r>
+    </w:p>
+    <w:p>
+      <w:pPr>
+        <w:spacing w:after="160" w:line="276"/>
+        <w:jc w:val="both"/>
+      </w:pPr>
+      <w:r>
+        <w:rPr>
+          <w:rFonts w:ascii="Calibri" w:cs="Calibri" w:eastAsia="Calibri" w:hAnsi="Calibri"/>
+          <w:sz w:val="22"/>
+          <w:szCs w:val="22"/>
+        </w:rPr>
+        <w:t xml:space="preserve">Running two keepers continuously, for hours, against a shared public RPC surfaced a real robustness gap no amount of short-lived testing had exposed: an ECONNRESET / “fetch failed” error, thrown deep inside @solana/web3.js's own connection-retry internals, rejected as an unhandled promise rejection outside the reach of the main scan loop's own try/catch — and Node's default behavior for an unhandled rejection is to crash the process. One of the two keepers died silently mid-run, hours into what was meant to be unattended operation, with nothing in its own application-level error handling ever having a chance to catch it.</w:t>
+      </w:r>
+    </w:p>
+    <w:p>
+      <w:pPr>
+        <w:spacing w:after="160" w:line="276"/>
+        <w:jc w:val="both"/>
+      </w:pPr>
+      <w:r>
+        <w:rPr>
+          <w:rFonts w:ascii="Calibri" w:cs="Calibri" w:eastAsia="Calibri" w:hAnsi="Calibri"/>
+          <w:sz w:val="22"/>
+          <w:szCs w:val="22"/>
+        </w:rPr>
+        <w:t xml:space="preserve">The fix adds process-level unhandledRejection and uncaughtException handlers that log and continue rather than let the default crash-the-process behavior apply — a deliberate, stated departure from the general advice to always let an uncaught exception take a process down, justified specifically because this keeper's poll loop carries no meaningful state between iterations, so continuing after a transient network fault is safe here in a way it would not be for a stateful long-running process. This was not left as an untested assumption: after restarting both keepers on the fixed build, the identical failure class — the same “TypeError: fetch failed” — recurred for real under live 429 rate-limit pressure on both keepers, and both survived it, continuing to log real, subsequent RESCUED outcomes afterward rather than dying.</w:t>
+      </w:r>
+    </w:p>
+    <w:p>
+      <w:pPr>
+        <w:pStyle w:val="Heading3"/>
+        <w:spacing w:after="120" w:before="240"/>
+      </w:pPr>
+      <w:r>
+        <w:rPr>
+          <w:b/>
+          <w:bCs/>
+        </w:rPr>
+        <w:t xml:space="preserve">12.16 Day 9, continued: the public documentation site, and a correction to Section 19's original plan</w:t>
+      </w:r>
+    </w:p>
+    <w:p>
+      <w:pPr>
+        <w:spacing w:after="160" w:line="276"/>
+        <w:jc w:val="both"/>
+      </w:pPr>
+      <w:r>
+        <w:rPr>
+          <w:rFonts w:ascii="Calibri" w:cs="Calibri" w:eastAsia="Calibri" w:hAnsi="Calibri"/>
+          <w:sz w:val="22"/>
+          <w:szCs w:val="22"/>
+        </w:rPr>
+        <w:t xml:space="preserve">Section 19, written earlier in this project's history, described a plan to split site/ into a separate public repository specifically so the protocol's own source could stay private while the site could still be deployed on a free hosting tier requiring public repositories. That plan was not what actually happened, and this report corrects it here rather than leaving an inaccurate claim standing elsewhere in the same document: site/ stayed exactly where it already was, inside the main protocol repository, and was deployed successfully from there, still private, via Cloudflare Workers — whose GitHub integration deploys directly from a private, organization-owned repository with no public-visibility requirement at all. The constraint Section 19 was originally designed around turned out not to be a universal one; it was specific to the first hosting platform tried (Netlify), not to hosting generally.</w:t>
+      </w:r>
+    </w:p>
+    <w:p>
+      <w:pPr>
+        <w:spacing w:after="160" w:line="276"/>
+        <w:jc w:val="both"/>
+      </w:pPr>
+      <w:r>
+        <w:rPr>
+          <w:rFonts w:ascii="Calibri" w:cs="Calibri" w:eastAsia="Calibri" w:hAnsi="Calibri"/>
+          <w:sz w:val="22"/>
+          <w:szCs w:val="22"/>
+        </w:rPr>
+        <w:t xml:space="preserve">Seven new documents were added to docs/ — INSTRUCTIONS.md, INTEGRATION_GUIDE.md, RUNNING_A_KEEPER.md, ECONOMIC_DESIGN.md, WORKED_EXAMPLES.md, ENGINEERING_LOG.md, and RISK_REGISTER.md — and are rendered directly from that same real markdown source into a genuine /docs section on the public site, with no content duplicated between the two; a change to a doc's real source is a change to what the live site shows, by construction, not by discipline. The site is live at https://inertia-protocol.odomushi-core.workers.dev/.</w:t>
+      </w:r>
+    </w:p>
+    <w:p>
+      <w:pPr>
+        <w:spacing w:after="160" w:line="276"/>
+        <w:jc w:val="both"/>
+      </w:pPr>
+      <w:r>
+        <w:rPr>
+          <w:rFonts w:ascii="Calibri" w:cs="Calibri" w:eastAsia="Calibri" w:hAnsi="Calibri"/>
+          <w:sz w:val="22"/>
+          <w:szCs w:val="22"/>
+        </w:rPr>
+        <w:t xml:space="preserve">Two real, separate bugs were found and fixed getting the static export to deploy correctly, worth recording honestly rather than only reporting the eventual success: a custom markdown-renderer extension whose heading/link overrides needed real function methods rather than arrow functions for a required this binding to work, and — the actual root cause of roughly an hour of repeated, confusing deploy failures — a local configuration change (enabling Next.js's static export mode) that had been tested successfully dozens of times locally but had never actually been committed to the repository Cloudflare's build system was cloning from. Every local test passed because it was testing the right, uncommitted file; every Cloudflare build failed because it was building the real, unmodified one. The mismatch, not anything wrong with Cloudflare's build environment, was the entire cause, and finding it required checking the actual git status rather than continuing to theorize about the hosting platform.</w:t>
+      </w:r>
+    </w:p>
+    <w:p>
+      <w:pPr>
         <w:pStyle w:val="Heading2"/>
         <w:spacing w:after="160" w:before="320"/>
       </w:pPr>
@@ -3810,6 +3939,20 @@
           <w:szCs w:val="22"/>
         </w:rPr>
         <w:t xml:space="preserve">Devnet activity to date is a deliberate demonstration of every code path (Section 21), not organic usage from real integrators or real users. That distinction matters: it proves the mechanism works, not that it has been battle-tested under conditions nobody designed.</w:t>
+      </w:r>
+    </w:p>
+    <w:p>
+      <w:pPr>
+        <w:spacing w:after="160" w:line="276"/>
+        <w:jc w:val="both"/>
+      </w:pPr>
+      <w:r>
+        <w:rPr>
+          <w:rFonts w:ascii="Calibri" w:cs="Calibri" w:eastAsia="Calibri" w:hAnsi="Calibri"/>
+          <w:sz w:val="22"/>
+          <w:szCs w:val="22"/>
+        </w:rPr>
+        <w:t xml:space="preserve">Keeper race safety under real concurrent competition is now proven (Section 12.14): two independently-keyed keepers racing the same live escrows produced zero double-spends and zero stuck funds across dozens of real races. Keeper race fairness has real, but not conclusive, supporting evidence — the win distribution converged toward even over a larger sample, arguing against pure determinism, but genuine keeper diversity (independent operators, varied infrastructure and latency) has not been tested, since both identities in this run shared the same machine and the same RPC connection.</w:t>
       </w:r>
     </w:p>
     <w:p>
@@ -5604,7 +5747,7 @@
           <w:sz w:val="22"/>
           <w:szCs w:val="22"/>
         </w:rPr>
-        <w:t xml:space="preserve">The swap-execution layer is deliberately pluggable, and two implementations exist as of this writing: mockDexSwap.ts, a thin adapter for the test-only mock-dex program described in Section 7 (a swap-shaped program that burns input tokens and mints output tokens with no real pricing or liquidity, existing only to prove the CPI relay works against a program Inertia doesn't control), and orcaSwap.ts, a real client against a real, independently-built DEX (Section 18.1). Neither the timing, discovery, nor profitability logic changes based on which swap-execution layer is plugged in — that logic is venue-agnostic by construction, and Section 18.1 is the proof that held up in practice, not just in design.</w:t>
+        <w:t xml:space="preserve">The swap-execution layer is deliberately pluggable. One test-only implementation exists in this package — mockDexSwap.ts, a thin adapter for the test-only mock-dex program described in Section 7 (a swap-shaped program that burns input tokens and mints output tokens with no real pricing or liquidity, existing only to prove the CPI relay works against a program Inertia doesn't control) — and three real implementations now live in @inertia-protocol/sdk rather than here (Section 12.13): orcaSwap.ts, raydiumCpmmSwap.ts, and meteoraDlmmSwap.ts, proven against three real, independently-built DEXes with genuinely different liquidity models (Section 18.1, Section 12.11, Section 12.12). Moving them into the SDK means any integrating platform or independent keeper operator can use the same real, proven clients directly, without depending on this reference bot's own internals. Neither the timing, discovery, nor profitability logic changes based on which swap-execution layer is plugged in — that logic is venue-agnostic by construction, and Sections 18.1, 12.11, and 12.12 are the proof that held up in practice, not just in design.</w:t>
       </w:r>
     </w:p>
     <w:p>
@@ -5700,7 +5843,7 @@
           <w:sz w:val="22"/>
           <w:szCs w:val="22"/>
         </w:rPr>
-        <w:t xml:space="preserve">The site (site/, a Next.js 16 application, not published as part of the core protocol repository — split into its own repository, github.com/Inertia-Protocol/site, specifically so the protocol's source could remain private while the site could be deployed on a free hosting tier that requires public repositories) exists to communicate the mechanism honestly, not to decorate it.</w:t>
+        <w:t xml:space="preserve">The site (site/, a Next.js 16 application) exists to communicate the mechanism honestly, not to decorate it. An earlier version of this report described a plan to split the site into its own, public repository so the protocol's own source could stay private while the site was still hostable on a free tier requiring public repositories; that plan turned out not to be necessary and was not what actually happened (Section 12.16 has the correction and the real deployment story) — the site stayed in the main repository throughout.</w:t>
       </w:r>
     </w:p>
     <w:p>
@@ -5715,6 +5858,20 @@
           <w:szCs w:val="22"/>
         </w:rPr>
         <w:t xml:space="preserve">Its central interactive element is a genuine state-machine animation of the actual rescue lifecycle described in Section 6 — pending, stalled, rescued — built as real, hand-authored SVG and CSS-driven state transitions, not a licensed illustration or a generic template animation. The surrounding visual language (an engineering blueprint aesthetic, a negative-space wordmark, real measured statistics rather than marketing copy) was a deliberate choice to match the register of the underlying engineering work: precise, technical, and willing to show its own numbers rather than describe itself in adjectives. The site's own copy states its real, current status directly — "early development, not yet deployed" — rather than implying more maturity than the project actually has.</w:t>
+      </w:r>
+    </w:p>
+    <w:p>
+      <w:pPr>
+        <w:spacing w:after="160" w:line="276"/>
+        <w:jc w:val="both"/>
+      </w:pPr>
+      <w:r>
+        <w:rPr>
+          <w:rFonts w:ascii="Calibri" w:cs="Calibri" w:eastAsia="Calibri" w:hAnsi="Calibri"/>
+          <w:sz w:val="22"/>
+          <w:szCs w:val="22"/>
+        </w:rPr>
+        <w:t xml:space="preserve">That line is now stale and is corrected here rather than left standing: the site is deployed, live, and includes a full public /docs section (Section 12.16) alongside the landing page, at https://inertia-protocol.odomushi-core.workers.dev/.</w:t>
       </w:r>
     </w:p>
     <w:p>
@@ -14208,139 +14365,48 @@
           <w:szCs w:val="18"/>
         </w:rPr>
         <w:t xml:space="preserve">inertia-protocol/</w:t>
-      </w:r>
-      <w:r>
-        <w:rPr>
-          <w:rFonts w:ascii="Consolas" w:cs="Consolas" w:eastAsia="Consolas" w:hAnsi="Consolas"/>
-          <w:sz w:val="18"/>
-          <w:szCs w:val="18"/>
-        </w:rPr>
         <w:br/>
         <w:t xml:space="preserve">├── programs/</w:t>
-      </w:r>
-      <w:r>
-        <w:rPr>
-          <w:rFonts w:ascii="Consolas" w:cs="Consolas" w:eastAsia="Consolas" w:hAnsi="Consolas"/>
-          <w:sz w:val="18"/>
-          <w:szCs w:val="18"/>
-        </w:rPr>
         <w:br/>
         <w:t xml:space="preserve">│   ├── inertia-protocol/     the on-chain program (5 instructions)</w:t>
-      </w:r>
-      <w:r>
-        <w:rPr>
-          <w:rFonts w:ascii="Consolas" w:cs="Consolas" w:eastAsia="Consolas" w:hAnsi="Consolas"/>
-          <w:sz w:val="18"/>
-          <w:szCs w:val="18"/>
-        </w:rPr>
         <w:br/>
         <w:t xml:space="preserve">│   └── mock-dex/             test-only swap program, not part of the</w:t>
-      </w:r>
-      <w:r>
-        <w:rPr>
-          <w:rFonts w:ascii="Consolas" w:cs="Consolas" w:eastAsia="Consolas" w:hAnsi="Consolas"/>
-          <w:sz w:val="18"/>
-          <w:szCs w:val="18"/>
-        </w:rPr>
         <w:br/>
         <w:t xml:space="preserve">│                              deployed protocol</w:t>
-      </w:r>
-      <w:r>
-        <w:rPr>
-          <w:rFonts w:ascii="Consolas" w:cs="Consolas" w:eastAsia="Consolas" w:hAnsi="Consolas"/>
-          <w:sz w:val="18"/>
-          <w:szCs w:val="18"/>
-        </w:rPr>
         <w:br/>
         <w:t xml:space="preserve">├── tests/                    TypeScript integration suite (8/8, Section 14)</w:t>
-      </w:r>
-      <w:r>
-        <w:rPr>
-          <w:rFonts w:ascii="Consolas" w:cs="Consolas" w:eastAsia="Consolas" w:hAnsi="Consolas"/>
-          <w:sz w:val="18"/>
-          <w:szCs w:val="18"/>
-        </w:rPr>
         <w:br/>
         <w:t xml:space="preserve">├── trident-tests/            Trident fuzz campaign (Section 15)</w:t>
-      </w:r>
-      <w:r>
-        <w:rPr>
-          <w:rFonts w:ascii="Consolas" w:cs="Consolas" w:eastAsia="Consolas" w:hAnsi="Consolas"/>
-          <w:sz w:val="18"/>
-          <w:szCs w:val="18"/>
-        </w:rPr>
+        <w:br/>
+        <w:t xml:space="preserve">├── docs/                     RISK_REGISTER.md, INTEGRATION_GUIDE.md,</w:t>
+        <w:br/>
+        <w:t xml:space="preserve">│                              INSTRUCTIONS.md, ECONOMIC_DESIGN.md,</w:t>
+        <w:br/>
+        <w:t xml:space="preserve">│                              WORKED_EXAMPLES.md, ENGINEERING_LOG.md,</w:t>
+        <w:br/>
+        <w:t xml:space="preserve">│                              RUNNING_A_KEEPER.md -- rendered live at</w:t>
+        <w:br/>
+        <w:t xml:space="preserve">│                              /docs on the site (Section 12.16)</w:t>
         <w:br/>
         <w:t xml:space="preserve">├── packages/</w:t>
-      </w:r>
-      <w:r>
-        <w:rPr>
-          <w:rFonts w:ascii="Consolas" w:cs="Consolas" w:eastAsia="Consolas" w:hAnsi="Consolas"/>
-          <w:sz w:val="18"/>
-          <w:szCs w:val="18"/>
-        </w:rPr>
         <w:br/>
-        <w:t xml:space="preserve">│   ├── sdk/                  @inertia-protocol/sdk (Section 17)</w:t>
-      </w:r>
-      <w:r>
-        <w:rPr>
-          <w:rFonts w:ascii="Consolas" w:cs="Consolas" w:eastAsia="Consolas" w:hAnsi="Consolas"/>
-          <w:sz w:val="18"/>
-          <w:szCs w:val="18"/>
-        </w:rPr>
+        <w:t xml:space="preserve">│   ├── sdk/                  @inertia-protocol/sdk (Section 17), including</w:t>
+        <w:br/>
+        <w:t xml:space="preserve">│   │                          the three real DEX swap-builder clients</w:t>
+        <w:br/>
+        <w:t xml:space="preserve">│   │                          (orcaSwap.ts, raydiumCpmmSwap.ts,</w:t>
+        <w:br/>
+        <w:t xml:space="preserve">│   │                          meteoraDlmmSwap.ts -- Section 12.13)</w:t>
         <w:br/>
         <w:t xml:space="preserve">│   └── keeper/                @inertia-protocol/keeper (Section 18)</w:t>
-      </w:r>
-      <w:r>
-        <w:rPr>
-          <w:rFonts w:ascii="Consolas" w:cs="Consolas" w:eastAsia="Consolas" w:hAnsi="Consolas"/>
-          <w:sz w:val="18"/>
-          <w:szCs w:val="18"/>
-        </w:rPr>
         <w:br/>
-        <w:t xml:space="preserve">│       ├── src/mockDexSwap.ts    test-only swap builder</w:t>
-      </w:r>
-      <w:r>
-        <w:rPr>
-          <w:rFonts w:ascii="Consolas" w:cs="Consolas" w:eastAsia="Consolas" w:hAnsi="Consolas"/>
-          <w:sz w:val="18"/>
-          <w:szCs w:val="18"/>
-        </w:rPr>
+        <w:t xml:space="preserve">│       └── src/mockDexSwap.ts    test-only swap builder only</w:t>
         <w:br/>
-        <w:t xml:space="preserve">│       └── src/orcaSwap.ts       real Orca Whirlpools swap builder (18.1)</w:t>
-      </w:r>
-      <w:r>
-        <w:rPr>
-          <w:rFonts w:ascii="Consolas" w:cs="Consolas" w:eastAsia="Consolas" w:hAnsi="Consolas"/>
-          <w:sz w:val="18"/>
-          <w:szCs w:val="18"/>
-        </w:rPr>
+        <w:t xml:space="preserve">├── site/                     public site + /docs, same repository,</w:t>
         <w:br/>
-        <w:t xml:space="preserve">├── site/                     public-facing site source (split into its</w:t>
-      </w:r>
-      <w:r>
-        <w:rPr>
-          <w:rFonts w:ascii="Consolas" w:cs="Consolas" w:eastAsia="Consolas" w:hAnsi="Consolas"/>
-          <w:sz w:val="18"/>
-          <w:szCs w:val="18"/>
-        </w:rPr>
-        <w:br/>
-        <w:t xml:space="preserve">│                              own repository for public hosting, Section 19)</w:t>
-      </w:r>
-      <w:r>
-        <w:rPr>
-          <w:rFonts w:ascii="Consolas" w:cs="Consolas" w:eastAsia="Consolas" w:hAnsi="Consolas"/>
-          <w:sz w:val="18"/>
-          <w:szCs w:val="18"/>
-        </w:rPr>
+        <w:t xml:space="preserve">│                              deployed via Cloudflare Workers (Section 12.16)</w:t>
         <w:br/>
         <w:t xml:space="preserve">├── README.md</w:t>
-      </w:r>
-      <w:r>
-        <w:rPr>
-          <w:rFonts w:ascii="Consolas" w:cs="Consolas" w:eastAsia="Consolas" w:hAnsi="Consolas"/>
-          <w:sz w:val="18"/>
-          <w:szCs w:val="18"/>
-        </w:rPr>
         <w:br/>
         <w:t xml:space="preserve">└── CONTRIBUTING.md            real build/test/fuzz gotchas, Part III</w:t>
       </w:r>
@@ -14412,247 +14478,58 @@
           <w:szCs w:val="18"/>
         </w:rPr>
         <w:t xml:space="preserve">use anchor_lang::prelude::*;</w:t>
-      </w:r>
-      <w:r>
-        <w:rPr>
-          <w:rFonts w:ascii="Consolas" w:cs="Consolas" w:eastAsia="Consolas" w:hAnsi="Consolas"/>
-          <w:sz w:val="18"/>
-          <w:szCs w:val="18"/>
-        </w:rPr>
         <w:br/>
         <w:t xml:space="preserve"/>
-      </w:r>
-      <w:r>
-        <w:rPr>
-          <w:rFonts w:ascii="Consolas" w:cs="Consolas" w:eastAsia="Consolas" w:hAnsi="Consolas"/>
-          <w:sz w:val="18"/>
-          <w:szCs w:val="18"/>
-        </w:rPr>
         <w:br/>
         <w:t xml:space="preserve">#[account]</w:t>
-      </w:r>
-      <w:r>
-        <w:rPr>
-          <w:rFonts w:ascii="Consolas" w:cs="Consolas" w:eastAsia="Consolas" w:hAnsi="Consolas"/>
-          <w:sz w:val="18"/>
-          <w:szCs w:val="18"/>
-        </w:rPr>
         <w:br/>
         <w:t xml:space="preserve">#[derive(InitSpace)]</w:t>
-      </w:r>
-      <w:r>
-        <w:rPr>
-          <w:rFonts w:ascii="Consolas" w:cs="Consolas" w:eastAsia="Consolas" w:hAnsi="Consolas"/>
-          <w:sz w:val="18"/>
-          <w:szCs w:val="18"/>
-        </w:rPr>
         <w:br/>
         <w:t xml:space="preserve">pub struct EscrowState {</w:t>
-      </w:r>
-      <w:r>
-        <w:rPr>
-          <w:rFonts w:ascii="Consolas" w:cs="Consolas" w:eastAsia="Consolas" w:hAnsi="Consolas"/>
-          <w:sz w:val="18"/>
-          <w:szCs w:val="18"/>
-        </w:rPr>
         <w:br/>
         <w:t xml:space="preserve">    pub user_wallet: Pubkey,</w:t>
-      </w:r>
-      <w:r>
-        <w:rPr>
-          <w:rFonts w:ascii="Consolas" w:cs="Consolas" w:eastAsia="Consolas" w:hAnsi="Consolas"/>
-          <w:sz w:val="18"/>
-          <w:szCs w:val="18"/>
-        </w:rPr>
         <w:br/>
         <w:t xml:space="preserve">    pub partner_wallet: Pubkey,</w:t>
-      </w:r>
-      <w:r>
-        <w:rPr>
-          <w:rFonts w:ascii="Consolas" w:cs="Consolas" w:eastAsia="Consolas" w:hAnsi="Consolas"/>
-          <w:sz w:val="18"/>
-          <w:szCs w:val="18"/>
-        </w:rPr>
         <w:br/>
         <w:t xml:space="preserve">    pub user_input_token_account: Pubkey,</w:t>
-      </w:r>
-      <w:r>
-        <w:rPr>
-          <w:rFonts w:ascii="Consolas" w:cs="Consolas" w:eastAsia="Consolas" w:hAnsi="Consolas"/>
-          <w:sz w:val="18"/>
-          <w:szCs w:val="18"/>
-        </w:rPr>
         <w:br/>
         <w:t xml:space="preserve">    pub input_amount: u64,</w:t>
-      </w:r>
-      <w:r>
-        <w:rPr>
-          <w:rFonts w:ascii="Consolas" w:cs="Consolas" w:eastAsia="Consolas" w:hAnsi="Consolas"/>
-          <w:sz w:val="18"/>
-          <w:szCs w:val="18"/>
-        </w:rPr>
         <w:br/>
         <w:t xml:space="preserve">    pub expected_program_id: Pubkey,</w:t>
-      </w:r>
-      <w:r>
-        <w:rPr>
-          <w:rFonts w:ascii="Consolas" w:cs="Consolas" w:eastAsia="Consolas" w:hAnsi="Consolas"/>
-          <w:sz w:val="18"/>
-          <w:szCs w:val="18"/>
-        </w:rPr>
         <w:br/>
         <w:t xml:space="preserve">    pub expected_discriminator: [u8; 8],</w:t>
-      </w:r>
-      <w:r>
-        <w:rPr>
-          <w:rFonts w:ascii="Consolas" w:cs="Consolas" w:eastAsia="Consolas" w:hAnsi="Consolas"/>
-          <w:sz w:val="18"/>
-          <w:szCs w:val="18"/>
-        </w:rPr>
         <w:br/>
         <w:t xml:space="preserve">    pub expected_destination_token_account: Pubkey,</w:t>
-      </w:r>
-      <w:r>
-        <w:rPr>
-          <w:rFonts w:ascii="Consolas" w:cs="Consolas" w:eastAsia="Consolas" w:hAnsi="Consolas"/>
-          <w:sz w:val="18"/>
-          <w:szCs w:val="18"/>
-        </w:rPr>
         <w:br/>
         <w:t xml:space="preserve">    pub expected_output_amount: u64,</w:t>
-      </w:r>
-      <w:r>
-        <w:rPr>
-          <w:rFonts w:ascii="Consolas" w:cs="Consolas" w:eastAsia="Consolas" w:hAnsi="Consolas"/>
-          <w:sz w:val="18"/>
-          <w:szCs w:val="18"/>
-        </w:rPr>
         <w:br/>
         <w:t xml:space="preserve">    pub gas_buffer_lamports: u64,</w:t>
-      </w:r>
-      <w:r>
-        <w:rPr>
-          <w:rFonts w:ascii="Consolas" w:cs="Consolas" w:eastAsia="Consolas" w:hAnsi="Consolas"/>
-          <w:sz w:val="18"/>
-          <w:szCs w:val="18"/>
-        </w:rPr>
         <w:br/>
         <w:t xml:space="preserve">    pub creation_slot: u64,</w:t>
-      </w:r>
-      <w:r>
-        <w:rPr>
-          <w:rFonts w:ascii="Consolas" w:cs="Consolas" w:eastAsia="Consolas" w:hAnsi="Consolas"/>
-          <w:sz w:val="18"/>
-          <w:szCs w:val="18"/>
-        </w:rPr>
         <w:br/>
         <w:t xml:space="preserve">    pub ttl_slots: u64,</w:t>
-      </w:r>
-      <w:r>
-        <w:rPr>
-          <w:rFonts w:ascii="Consolas" w:cs="Consolas" w:eastAsia="Consolas" w:hAnsi="Consolas"/>
-          <w:sz w:val="18"/>
-          <w:szCs w:val="18"/>
-        </w:rPr>
         <w:br/>
         <w:t xml:space="preserve">    pub nonce: u64,</w:t>
-      </w:r>
-      <w:r>
-        <w:rPr>
-          <w:rFonts w:ascii="Consolas" w:cs="Consolas" w:eastAsia="Consolas" w:hAnsi="Consolas"/>
-          <w:sz w:val="18"/>
-          <w:szCs w:val="18"/>
-        </w:rPr>
         <w:br/>
         <w:t xml:space="preserve">    pub status: EscrowStatus,</w:t>
-      </w:r>
-      <w:r>
-        <w:rPr>
-          <w:rFonts w:ascii="Consolas" w:cs="Consolas" w:eastAsia="Consolas" w:hAnsi="Consolas"/>
-          <w:sz w:val="18"/>
-          <w:szCs w:val="18"/>
-        </w:rPr>
         <w:br/>
         <w:t xml:space="preserve">    pub bump: u8,</w:t>
-      </w:r>
-      <w:r>
-        <w:rPr>
-          <w:rFonts w:ascii="Consolas" w:cs="Consolas" w:eastAsia="Consolas" w:hAnsi="Consolas"/>
-          <w:sz w:val="18"/>
-          <w:szCs w:val="18"/>
-        </w:rPr>
         <w:br/>
         <w:t xml:space="preserve">}</w:t>
-      </w:r>
-      <w:r>
-        <w:rPr>
-          <w:rFonts w:ascii="Consolas" w:cs="Consolas" w:eastAsia="Consolas" w:hAnsi="Consolas"/>
-          <w:sz w:val="18"/>
-          <w:szCs w:val="18"/>
-        </w:rPr>
         <w:br/>
         <w:t xml:space="preserve"/>
-      </w:r>
-      <w:r>
-        <w:rPr>
-          <w:rFonts w:ascii="Consolas" w:cs="Consolas" w:eastAsia="Consolas" w:hAnsi="Consolas"/>
-          <w:sz w:val="18"/>
-          <w:szCs w:val="18"/>
-        </w:rPr>
         <w:br/>
         <w:t xml:space="preserve">#[derive(AnchorSerialize, AnchorDeserialize, Clone, Copy, PartialEq, Eq, InitSpace)]</w:t>
-      </w:r>
-      <w:r>
-        <w:rPr>
-          <w:rFonts w:ascii="Consolas" w:cs="Consolas" w:eastAsia="Consolas" w:hAnsi="Consolas"/>
-          <w:sz w:val="18"/>
-          <w:szCs w:val="18"/>
-        </w:rPr>
         <w:br/>
         <w:t xml:space="preserve">pub enum EscrowStatus {</w:t>
-      </w:r>
-      <w:r>
-        <w:rPr>
-          <w:rFonts w:ascii="Consolas" w:cs="Consolas" w:eastAsia="Consolas" w:hAnsi="Consolas"/>
-          <w:sz w:val="18"/>
-          <w:szCs w:val="18"/>
-        </w:rPr>
         <w:br/>
         <w:t xml:space="preserve">    Pending,</w:t>
-      </w:r>
-      <w:r>
-        <w:rPr>
-          <w:rFonts w:ascii="Consolas" w:cs="Consolas" w:eastAsia="Consolas" w:hAnsi="Consolas"/>
-          <w:sz w:val="18"/>
-          <w:szCs w:val="18"/>
-        </w:rPr>
         <w:br/>
         <w:t xml:space="preserve">    Executed,</w:t>
-      </w:r>
-      <w:r>
-        <w:rPr>
-          <w:rFonts w:ascii="Consolas" w:cs="Consolas" w:eastAsia="Consolas" w:hAnsi="Consolas"/>
-          <w:sz w:val="18"/>
-          <w:szCs w:val="18"/>
-        </w:rPr>
         <w:br/>
         <w:t xml:space="preserve">    Rescued,</w:t>
-      </w:r>
-      <w:r>
-        <w:rPr>
-          <w:rFonts w:ascii="Consolas" w:cs="Consolas" w:eastAsia="Consolas" w:hAnsi="Consolas"/>
-          <w:sz w:val="18"/>
-          <w:szCs w:val="18"/>
-        </w:rPr>
         <w:br/>
         <w:t xml:space="preserve">    Expired,</w:t>
-      </w:r>
-      <w:r>
-        <w:rPr>
-          <w:rFonts w:ascii="Consolas" w:cs="Consolas" w:eastAsia="Consolas" w:hAnsi="Consolas"/>
-          <w:sz w:val="18"/>
-          <w:szCs w:val="18"/>
-        </w:rPr>
         <w:br/>
         <w:t xml:space="preserve">}</w:t>
       </w:r>
@@ -14715,247 +14592,58 @@
           <w:szCs w:val="18"/>
         </w:rPr>
         <w:t xml:space="preserve">pub const ESCROW_SEED: &amp;[u8] = b"escrow";</w:t>
-      </w:r>
-      <w:r>
-        <w:rPr>
-          <w:rFonts w:ascii="Consolas" w:cs="Consolas" w:eastAsia="Consolas" w:hAnsi="Consolas"/>
-          <w:sz w:val="18"/>
-          <w:szCs w:val="18"/>
-        </w:rPr>
         <w:br/>
         <w:t xml:space="preserve"/>
-      </w:r>
-      <w:r>
-        <w:rPr>
-          <w:rFonts w:ascii="Consolas" w:cs="Consolas" w:eastAsia="Consolas" w:hAnsi="Consolas"/>
-          <w:sz w:val="18"/>
-          <w:szCs w:val="18"/>
-        </w:rPr>
         <w:br/>
         <w:t xml:space="preserve">pub const TTL_SLOTS: u64 = 2;</w:t>
-      </w:r>
-      <w:r>
-        <w:rPr>
-          <w:rFonts w:ascii="Consolas" w:cs="Consolas" w:eastAsia="Consolas" w:hAnsi="Consolas"/>
-          <w:sz w:val="18"/>
-          <w:szCs w:val="18"/>
-        </w:rPr>
         <w:br/>
         <w:t xml:space="preserve">pub const SELF_RESCUE_SLOTS: u64 = 150;</w:t>
-      </w:r>
-      <w:r>
-        <w:rPr>
-          <w:rFonts w:ascii="Consolas" w:cs="Consolas" w:eastAsia="Consolas" w:hAnsi="Consolas"/>
-          <w:sz w:val="18"/>
-          <w:szCs w:val="18"/>
-        </w:rPr>
         <w:br/>
         <w:t xml:space="preserve">pub const CLEANUP_SLOTS: u64 = 300;</w:t>
-      </w:r>
-      <w:r>
-        <w:rPr>
-          <w:rFonts w:ascii="Consolas" w:cs="Consolas" w:eastAsia="Consolas" w:hAnsi="Consolas"/>
-          <w:sz w:val="18"/>
-          <w:szCs w:val="18"/>
-        </w:rPr>
         <w:br/>
         <w:t xml:space="preserve"/>
-      </w:r>
-      <w:r>
-        <w:rPr>
-          <w:rFonts w:ascii="Consolas" w:cs="Consolas" w:eastAsia="Consolas" w:hAnsi="Consolas"/>
-          <w:sz w:val="18"/>
-          <w:szCs w:val="18"/>
-        </w:rPr>
         <w:br/>
         <w:t xml:space="preserve">pub const BASIS_POINTS_DIVISOR: u128 = 10_000;</w:t>
-      </w:r>
-      <w:r>
-        <w:rPr>
-          <w:rFonts w:ascii="Consolas" w:cs="Consolas" w:eastAsia="Consolas" w:hAnsi="Consolas"/>
-          <w:sz w:val="18"/>
-          <w:szCs w:val="18"/>
-        </w:rPr>
         <w:br/>
         <w:t xml:space="preserve">pub const KEEPER_SHARE_BPS: u128 = 9_000;</w:t>
-      </w:r>
-      <w:r>
-        <w:rPr>
-          <w:rFonts w:ascii="Consolas" w:cs="Consolas" w:eastAsia="Consolas" w:hAnsi="Consolas"/>
-          <w:sz w:val="18"/>
-          <w:szCs w:val="18"/>
-        </w:rPr>
         <w:br/>
         <w:t xml:space="preserve">pub const PARTNER_SHARE_BPS: u128 = 500;</w:t>
-      </w:r>
-      <w:r>
-        <w:rPr>
-          <w:rFonts w:ascii="Consolas" w:cs="Consolas" w:eastAsia="Consolas" w:hAnsi="Consolas"/>
-          <w:sz w:val="18"/>
-          <w:szCs w:val="18"/>
-        </w:rPr>
         <w:br/>
         <w:t xml:space="preserve">pub const TREASURY_SHARE_BPS: u128 = 500;</w:t>
-      </w:r>
-      <w:r>
-        <w:rPr>
-          <w:rFonts w:ascii="Consolas" w:cs="Consolas" w:eastAsia="Consolas" w:hAnsi="Consolas"/>
-          <w:sz w:val="18"/>
-          <w:szCs w:val="18"/>
-        </w:rPr>
         <w:br/>
         <w:t xml:space="preserve">pub const CLEANUP_BOUNTY_BPS: u128 = 1_000;</w:t>
-      </w:r>
-      <w:r>
-        <w:rPr>
-          <w:rFonts w:ascii="Consolas" w:cs="Consolas" w:eastAsia="Consolas" w:hAnsi="Consolas"/>
-          <w:sz w:val="18"/>
-          <w:szCs w:val="18"/>
-        </w:rPr>
         <w:br/>
         <w:t xml:space="preserve"/>
-      </w:r>
-      <w:r>
-        <w:rPr>
-          <w:rFonts w:ascii="Consolas" w:cs="Consolas" w:eastAsia="Consolas" w:hAnsi="Consolas"/>
-          <w:sz w:val="18"/>
-          <w:szCs w:val="18"/>
-        </w:rPr>
         <w:br/>
         <w:t xml:space="preserve">pub const TREASURY_PUBKEY: Pubkey =</w:t>
-      </w:r>
-      <w:r>
-        <w:rPr>
-          <w:rFonts w:ascii="Consolas" w:cs="Consolas" w:eastAsia="Consolas" w:hAnsi="Consolas"/>
-          <w:sz w:val="18"/>
-          <w:szCs w:val="18"/>
-        </w:rPr>
         <w:br/>
         <w:t xml:space="preserve">    pubkey!("AX32tpNHzJsDvYvSuuT7NCiSQy6tMMyDdvrNzGYm8tYK");</w:t>
-      </w:r>
-      <w:r>
-        <w:rPr>
-          <w:rFonts w:ascii="Consolas" w:cs="Consolas" w:eastAsia="Consolas" w:hAnsi="Consolas"/>
-          <w:sz w:val="18"/>
-          <w:szCs w:val="18"/>
-        </w:rPr>
         <w:br/>
         <w:t xml:space="preserve"/>
-      </w:r>
-      <w:r>
-        <w:rPr>
-          <w:rFonts w:ascii="Consolas" w:cs="Consolas" w:eastAsia="Consolas" w:hAnsi="Consolas"/>
-          <w:sz w:val="18"/>
-          <w:szCs w:val="18"/>
-        </w:rPr>
         <w:br/>
         <w:t xml:space="preserve">pub const MIN_JITO_TIP_LAMPORTS: u64 = 10_000;</w:t>
-      </w:r>
-      <w:r>
-        <w:rPr>
-          <w:rFonts w:ascii="Consolas" w:cs="Consolas" w:eastAsia="Consolas" w:hAnsi="Consolas"/>
-          <w:sz w:val="18"/>
-          <w:szCs w:val="18"/>
-        </w:rPr>
         <w:br/>
         <w:t xml:space="preserve">pub const TIP_DECAY_SLOTS: u64 = 15;</w:t>
-      </w:r>
-      <w:r>
-        <w:rPr>
-          <w:rFonts w:ascii="Consolas" w:cs="Consolas" w:eastAsia="Consolas" w:hAnsi="Consolas"/>
-          <w:sz w:val="18"/>
-          <w:szCs w:val="18"/>
-        </w:rPr>
         <w:br/>
         <w:t xml:space="preserve"/>
-      </w:r>
-      <w:r>
-        <w:rPr>
-          <w:rFonts w:ascii="Consolas" w:cs="Consolas" w:eastAsia="Consolas" w:hAnsi="Consolas"/>
-          <w:sz w:val="18"/>
-          <w:szCs w:val="18"/>
-        </w:rPr>
         <w:br/>
         <w:t xml:space="preserve">pub const JITO_TIP_ACCOUNTS: [Pubkey; 8] = [</w:t>
-      </w:r>
-      <w:r>
-        <w:rPr>
-          <w:rFonts w:ascii="Consolas" w:cs="Consolas" w:eastAsia="Consolas" w:hAnsi="Consolas"/>
-          <w:sz w:val="18"/>
-          <w:szCs w:val="18"/>
-        </w:rPr>
         <w:br/>
         <w:t xml:space="preserve">    pubkey!("96gYZGLnJYVFmbjzopPSU6QiEV5fGqZNyN9nmNhvrZU5"),</w:t>
-      </w:r>
-      <w:r>
-        <w:rPr>
-          <w:rFonts w:ascii="Consolas" w:cs="Consolas" w:eastAsia="Consolas" w:hAnsi="Consolas"/>
-          <w:sz w:val="18"/>
-          <w:szCs w:val="18"/>
-        </w:rPr>
         <w:br/>
         <w:t xml:space="preserve">    pubkey!("HFqU5x63VTqvQss8hp11i4wVV8bD44PvwucfZ2bU7gRe"),</w:t>
-      </w:r>
-      <w:r>
-        <w:rPr>
-          <w:rFonts w:ascii="Consolas" w:cs="Consolas" w:eastAsia="Consolas" w:hAnsi="Consolas"/>
-          <w:sz w:val="18"/>
-          <w:szCs w:val="18"/>
-        </w:rPr>
         <w:br/>
         <w:t xml:space="preserve">    pubkey!("Cw8CFyM9FkoMi7K7Crf6HNQqf4uEMzpKw6QNghXLvLkY"),</w:t>
-      </w:r>
-      <w:r>
-        <w:rPr>
-          <w:rFonts w:ascii="Consolas" w:cs="Consolas" w:eastAsia="Consolas" w:hAnsi="Consolas"/>
-          <w:sz w:val="18"/>
-          <w:szCs w:val="18"/>
-        </w:rPr>
         <w:br/>
         <w:t xml:space="preserve">    pubkey!("ADaUMid9yfUytqMBgopwjb2DTLSokTSzL1zt6iGPaS49"),</w:t>
-      </w:r>
-      <w:r>
-        <w:rPr>
-          <w:rFonts w:ascii="Consolas" w:cs="Consolas" w:eastAsia="Consolas" w:hAnsi="Consolas"/>
-          <w:sz w:val="18"/>
-          <w:szCs w:val="18"/>
-        </w:rPr>
         <w:br/>
         <w:t xml:space="preserve">    pubkey!("DfXygSm4jCyNCybVYYK6DwvWqjKee8pbDmJGcLWNDXjh"),</w:t>
-      </w:r>
-      <w:r>
-        <w:rPr>
-          <w:rFonts w:ascii="Consolas" w:cs="Consolas" w:eastAsia="Consolas" w:hAnsi="Consolas"/>
-          <w:sz w:val="18"/>
-          <w:szCs w:val="18"/>
-        </w:rPr>
         <w:br/>
         <w:t xml:space="preserve">    pubkey!("ADuUkR4vqLUMWXxW9gh6D6L8pMSawimctcNZ5pGwDcEt"),</w:t>
-      </w:r>
-      <w:r>
-        <w:rPr>
-          <w:rFonts w:ascii="Consolas" w:cs="Consolas" w:eastAsia="Consolas" w:hAnsi="Consolas"/>
-          <w:sz w:val="18"/>
-          <w:szCs w:val="18"/>
-        </w:rPr>
         <w:br/>
         <w:t xml:space="preserve">    pubkey!("DttWaMuVvTiduZRnguLF7jNxTgiMBZ1hyAumKUiL2KRL"),</w:t>
-      </w:r>
-      <w:r>
-        <w:rPr>
-          <w:rFonts w:ascii="Consolas" w:cs="Consolas" w:eastAsia="Consolas" w:hAnsi="Consolas"/>
-          <w:sz w:val="18"/>
-          <w:szCs w:val="18"/>
-        </w:rPr>
         <w:br/>
         <w:t xml:space="preserve">    pubkey!("3AVi9Tg9Uo68tJfuvoKvqKNWKkC5wPdSSdeBnizKZ6jT"),</w:t>
-      </w:r>
-      <w:r>
-        <w:rPr>
-          <w:rFonts w:ascii="Consolas" w:cs="Consolas" w:eastAsia="Consolas" w:hAnsi="Consolas"/>
-          <w:sz w:val="18"/>
-          <w:szCs w:val="18"/>
-        </w:rPr>
         <w:br/>
         <w:t xml:space="preserve">];</w:t>
       </w:r>
@@ -15032,292 +14720,68 @@
           <w:szCs w:val="18"/>
         </w:rPr>
         <w:t xml:space="preserve">#[error_code]</w:t>
-      </w:r>
-      <w:r>
-        <w:rPr>
-          <w:rFonts w:ascii="Consolas" w:cs="Consolas" w:eastAsia="Consolas" w:hAnsi="Consolas"/>
-          <w:sz w:val="18"/>
-          <w:szCs w:val="18"/>
-        </w:rPr>
         <w:br/>
         <w:t xml:space="preserve">pub enum InertiaError {</w:t>
-      </w:r>
-      <w:r>
-        <w:rPr>
-          <w:rFonts w:ascii="Consolas" w:cs="Consolas" w:eastAsia="Consolas" w:hAnsi="Consolas"/>
-          <w:sz w:val="18"/>
-          <w:szCs w:val="18"/>
-        </w:rPr>
         <w:br/>
         <w:t xml:space="preserve">    #[msg("Gas buffer is below the dynamic minimum required")]</w:t>
-      </w:r>
-      <w:r>
-        <w:rPr>
-          <w:rFonts w:ascii="Consolas" w:cs="Consolas" w:eastAsia="Consolas" w:hAnsi="Consolas"/>
-          <w:sz w:val="18"/>
-          <w:szCs w:val="18"/>
-        </w:rPr>
         <w:br/>
         <w:t xml:space="preserve">    BufferBelowMinimum,</w:t>
-      </w:r>
-      <w:r>
-        <w:rPr>
-          <w:rFonts w:ascii="Consolas" w:cs="Consolas" w:eastAsia="Consolas" w:hAnsi="Consolas"/>
-          <w:sz w:val="18"/>
-          <w:szCs w:val="18"/>
-        </w:rPr>
         <w:br/>
         <w:t xml:space="preserve">    #[msg("Escrow is not in Pending status")]</w:t>
-      </w:r>
-      <w:r>
-        <w:rPr>
-          <w:rFonts w:ascii="Consolas" w:cs="Consolas" w:eastAsia="Consolas" w:hAnsi="Consolas"/>
-          <w:sz w:val="18"/>
-          <w:szCs w:val="18"/>
-        </w:rPr>
         <w:br/>
         <w:t xml:space="preserve">    NotPending,</w:t>
-      </w:r>
-      <w:r>
-        <w:rPr>
-          <w:rFonts w:ascii="Consolas" w:cs="Consolas" w:eastAsia="Consolas" w:hAnsi="Consolas"/>
-          <w:sz w:val="18"/>
-          <w:szCs w:val="18"/>
-        </w:rPr>
         <w:br/>
         <w:t xml:space="preserve">    #[msg("TTL has not yet elapsed")]</w:t>
-      </w:r>
-      <w:r>
-        <w:rPr>
-          <w:rFonts w:ascii="Consolas" w:cs="Consolas" w:eastAsia="Consolas" w:hAnsi="Consolas"/>
-          <w:sz w:val="18"/>
-          <w:szCs w:val="18"/>
-        </w:rPr>
         <w:br/>
         <w:t xml:space="preserve">    TtlNotElapsed,</w:t>
-      </w:r>
-      <w:r>
-        <w:rPr>
-          <w:rFonts w:ascii="Consolas" w:cs="Consolas" w:eastAsia="Consolas" w:hAnsi="Consolas"/>
-          <w:sz w:val="18"/>
-          <w:szCs w:val="18"/>
-        </w:rPr>
         <w:br/>
         <w:t xml:space="preserve">    #[msg("Self-rescue window has not yet elapsed")]</w:t>
-      </w:r>
-      <w:r>
-        <w:rPr>
-          <w:rFonts w:ascii="Consolas" w:cs="Consolas" w:eastAsia="Consolas" w:hAnsi="Consolas"/>
-          <w:sz w:val="18"/>
-          <w:szCs w:val="18"/>
-        </w:rPr>
         <w:br/>
         <w:t xml:space="preserve">    SelfRescueWindowNotElapsed,</w:t>
-      </w:r>
-      <w:r>
-        <w:rPr>
-          <w:rFonts w:ascii="Consolas" w:cs="Consolas" w:eastAsia="Consolas" w:hAnsi="Consolas"/>
-          <w:sz w:val="18"/>
-          <w:szCs w:val="18"/>
-        </w:rPr>
         <w:br/>
         <w:t xml:space="preserve">    #[msg("Cleanup window has not yet elapsed")]</w:t>
-      </w:r>
-      <w:r>
-        <w:rPr>
-          <w:rFonts w:ascii="Consolas" w:cs="Consolas" w:eastAsia="Consolas" w:hAnsi="Consolas"/>
-          <w:sz w:val="18"/>
-          <w:szCs w:val="18"/>
-        </w:rPr>
         <w:br/>
         <w:t xml:space="preserve">    CleanupWindowNotElapsed,</w:t>
-      </w:r>
-      <w:r>
-        <w:rPr>
-          <w:rFonts w:ascii="Consolas" w:cs="Consolas" w:eastAsia="Consolas" w:hAnsi="Consolas"/>
-          <w:sz w:val="18"/>
-          <w:szCs w:val="18"/>
-        </w:rPr>
         <w:br/>
         <w:t xml:space="preserve">    #[msg("Jito tip instruction not found in transaction")]</w:t>
-      </w:r>
-      <w:r>
-        <w:rPr>
-          <w:rFonts w:ascii="Consolas" w:cs="Consolas" w:eastAsia="Consolas" w:hAnsi="Consolas"/>
-          <w:sz w:val="18"/>
-          <w:szCs w:val="18"/>
-        </w:rPr>
         <w:br/>
         <w:t xml:space="preserve">    MissingJitoTip,</w:t>
-      </w:r>
-      <w:r>
-        <w:rPr>
-          <w:rFonts w:ascii="Consolas" w:cs="Consolas" w:eastAsia="Consolas" w:hAnsi="Consolas"/>
-          <w:sz w:val="18"/>
-          <w:szCs w:val="18"/>
-        </w:rPr>
         <w:br/>
         <w:t xml:space="preserve">    #[msg("Expected swap instruction not found in transaction")]</w:t>
-      </w:r>
-      <w:r>
-        <w:rPr>
-          <w:rFonts w:ascii="Consolas" w:cs="Consolas" w:eastAsia="Consolas" w:hAnsi="Consolas"/>
-          <w:sz w:val="18"/>
-          <w:szCs w:val="18"/>
-        </w:rPr>
         <w:br/>
         <w:t xml:space="preserve">    MissingSwapInstruction,</w:t>
-      </w:r>
-      <w:r>
-        <w:rPr>
-          <w:rFonts w:ascii="Consolas" w:cs="Consolas" w:eastAsia="Consolas" w:hAnsi="Consolas"/>
-          <w:sz w:val="18"/>
-          <w:szCs w:val="18"/>
-        </w:rPr>
         <w:br/>
         <w:t xml:space="preserve">    #[msg("Swap instruction destination account does not match escrow record")]</w:t>
-      </w:r>
-      <w:r>
-        <w:rPr>
-          <w:rFonts w:ascii="Consolas" w:cs="Consolas" w:eastAsia="Consolas" w:hAnsi="Consolas"/>
-          <w:sz w:val="18"/>
-          <w:szCs w:val="18"/>
-        </w:rPr>
         <w:br/>
         <w:t xml:space="preserve">    SwapDestinationMismatch,</w:t>
-      </w:r>
-      <w:r>
-        <w:rPr>
-          <w:rFonts w:ascii="Consolas" w:cs="Consolas" w:eastAsia="Consolas" w:hAnsi="Consolas"/>
-          <w:sz w:val="18"/>
-          <w:szCs w:val="18"/>
-        </w:rPr>
         <w:br/>
         <w:t xml:space="preserve">    #[msg("Signer does not match the keeper wallet submitting acceleration")]</w:t>
-      </w:r>
-      <w:r>
-        <w:rPr>
-          <w:rFonts w:ascii="Consolas" w:cs="Consolas" w:eastAsia="Consolas" w:hAnsi="Consolas"/>
-          <w:sz w:val="18"/>
-          <w:szCs w:val="18"/>
-        </w:rPr>
         <w:br/>
         <w:t xml:space="preserve">    KeeperSignerMismatch,</w:t>
-      </w:r>
-      <w:r>
-        <w:rPr>
-          <w:rFonts w:ascii="Consolas" w:cs="Consolas" w:eastAsia="Consolas" w:hAnsi="Consolas"/>
-          <w:sz w:val="18"/>
-          <w:szCs w:val="18"/>
-        </w:rPr>
         <w:br/>
         <w:t xml:space="preserve">    #[msg("Only the original user wallet may call this instruction")]</w:t>
-      </w:r>
-      <w:r>
-        <w:rPr>
-          <w:rFonts w:ascii="Consolas" w:cs="Consolas" w:eastAsia="Consolas" w:hAnsi="Consolas"/>
-          <w:sz w:val="18"/>
-          <w:szCs w:val="18"/>
-        </w:rPr>
         <w:br/>
         <w:t xml:space="preserve">    UnauthorizedUser,</w:t>
-      </w:r>
-      <w:r>
-        <w:rPr>
-          <w:rFonts w:ascii="Consolas" w:cs="Consolas" w:eastAsia="Consolas" w:hAnsi="Consolas"/>
-          <w:sz w:val="18"/>
-          <w:szCs w:val="18"/>
-        </w:rPr>
         <w:br/>
         <w:t xml:space="preserve">    #[msg("Arithmetic overflow")]</w:t>
-      </w:r>
-      <w:r>
-        <w:rPr>
-          <w:rFonts w:ascii="Consolas" w:cs="Consolas" w:eastAsia="Consolas" w:hAnsi="Consolas"/>
-          <w:sz w:val="18"/>
-          <w:szCs w:val="18"/>
-        </w:rPr>
         <w:br/>
         <w:t xml:space="preserve">    Overflow,</w:t>
-      </w:r>
-      <w:r>
-        <w:rPr>
-          <w:rFonts w:ascii="Consolas" w:cs="Consolas" w:eastAsia="Consolas" w:hAnsi="Consolas"/>
-          <w:sz w:val="18"/>
-          <w:szCs w:val="18"/>
-        </w:rPr>
         <w:br/>
         <w:t xml:space="preserve">    #[msg("Fee split does not sum to total buffer")]</w:t>
-      </w:r>
-      <w:r>
-        <w:rPr>
-          <w:rFonts w:ascii="Consolas" w:cs="Consolas" w:eastAsia="Consolas" w:hAnsi="Consolas"/>
-          <w:sz w:val="18"/>
-          <w:szCs w:val="18"/>
-        </w:rPr>
         <w:br/>
         <w:t xml:space="preserve">    FeeSplitMismatch,</w:t>
-      </w:r>
-      <w:r>
-        <w:rPr>
-          <w:rFonts w:ascii="Consolas" w:cs="Consolas" w:eastAsia="Consolas" w:hAnsi="Consolas"/>
-          <w:sz w:val="18"/>
-          <w:szCs w:val="18"/>
-        </w:rPr>
         <w:br/>
         <w:t xml:space="preserve">    #[msg("Supplied swap instruction data is missing or has the wrong discriminator")]</w:t>
-      </w:r>
-      <w:r>
-        <w:rPr>
-          <w:rFonts w:ascii="Consolas" w:cs="Consolas" w:eastAsia="Consolas" w:hAnsi="Consolas"/>
-          <w:sz w:val="18"/>
-          <w:szCs w:val="18"/>
-        </w:rPr>
         <w:br/>
         <w:t xml:space="preserve">    InvalidSwapInstructionData,</w:t>
-      </w:r>
-      <w:r>
-        <w:rPr>
-          <w:rFonts w:ascii="Consolas" w:cs="Consolas" w:eastAsia="Consolas" w:hAnsi="Consolas"/>
-          <w:sz w:val="18"/>
-          <w:szCs w:val="18"/>
-        </w:rPr>
         <w:br/>
         <w:t xml:space="preserve">    #[msg("Swap output was below the escrow's minimum acceptable amount")]</w:t>
-      </w:r>
-      <w:r>
-        <w:rPr>
-          <w:rFonts w:ascii="Consolas" w:cs="Consolas" w:eastAsia="Consolas" w:hAnsi="Consolas"/>
-          <w:sz w:val="18"/>
-          <w:szCs w:val="18"/>
-        </w:rPr>
         <w:br/>
         <w:t xml:space="preserve">    OutputBelowMinimum,</w:t>
-      </w:r>
-      <w:r>
-        <w:rPr>
-          <w:rFonts w:ascii="Consolas" w:cs="Consolas" w:eastAsia="Consolas" w:hAnsi="Consolas"/>
-          <w:sz w:val="18"/>
-          <w:szCs w:val="18"/>
-        </w:rPr>
         <w:br/>
         <w:t xml:space="preserve">    #[msg("A required account (input token account, destination token account, or the real token program) was not found in the supplied swap accounts")]</w:t>
-      </w:r>
-      <w:r>
-        <w:rPr>
-          <w:rFonts w:ascii="Consolas" w:cs="Consolas" w:eastAsia="Consolas" w:hAnsi="Consolas"/>
-          <w:sz w:val="18"/>
-          <w:szCs w:val="18"/>
-        </w:rPr>
         <w:br/>
         <w:t xml:space="preserve">    MissingRequiredSwapAccount,</w:t>
-      </w:r>
-      <w:r>
-        <w:rPr>
-          <w:rFonts w:ascii="Consolas" w:cs="Consolas" w:eastAsia="Consolas" w:hAnsi="Consolas"/>
-          <w:sz w:val="18"/>
-          <w:szCs w:val="18"/>
-        </w:rPr>
         <w:br/>
         <w:t xml:space="preserve">}</w:t>
       </w:r>
@@ -15380,175 +14844,42 @@
           <w:szCs w:val="18"/>
         </w:rPr>
         <w:t xml:space="preserve">pub fn split_share(total: u64, share_bps: u128) -&gt; Result&lt;u64&gt; {</w:t>
-      </w:r>
-      <w:r>
-        <w:rPr>
-          <w:rFonts w:ascii="Consolas" w:cs="Consolas" w:eastAsia="Consolas" w:hAnsi="Consolas"/>
-          <w:sz w:val="18"/>
-          <w:szCs w:val="18"/>
-        </w:rPr>
         <w:br/>
         <w:t xml:space="preserve">    u64::try_from((total as u128) * share_bps / BASIS_POINTS_DIVISOR)</w:t>
-      </w:r>
-      <w:r>
-        <w:rPr>
-          <w:rFonts w:ascii="Consolas" w:cs="Consolas" w:eastAsia="Consolas" w:hAnsi="Consolas"/>
-          <w:sz w:val="18"/>
-          <w:szCs w:val="18"/>
-        </w:rPr>
         <w:br/>
         <w:t xml:space="preserve">        .map_err(|_| InertiaError::Overflow.into())</w:t>
-      </w:r>
-      <w:r>
-        <w:rPr>
-          <w:rFonts w:ascii="Consolas" w:cs="Consolas" w:eastAsia="Consolas" w:hAnsi="Consolas"/>
-          <w:sz w:val="18"/>
-          <w:szCs w:val="18"/>
-        </w:rPr>
         <w:br/>
         <w:t xml:space="preserve">}</w:t>
-      </w:r>
-      <w:r>
-        <w:rPr>
-          <w:rFonts w:ascii="Consolas" w:cs="Consolas" w:eastAsia="Consolas" w:hAnsi="Consolas"/>
-          <w:sz w:val="18"/>
-          <w:szCs w:val="18"/>
-        </w:rPr>
         <w:br/>
         <w:t xml:space="preserve"/>
-      </w:r>
-      <w:r>
-        <w:rPr>
-          <w:rFonts w:ascii="Consolas" w:cs="Consolas" w:eastAsia="Consolas" w:hAnsi="Consolas"/>
-          <w:sz w:val="18"/>
-          <w:szCs w:val="18"/>
-        </w:rPr>
         <w:br/>
         <w:t xml:space="preserve">pub fn move_lamports&lt;'info&gt;(</w:t>
-      </w:r>
-      <w:r>
-        <w:rPr>
-          <w:rFonts w:ascii="Consolas" w:cs="Consolas" w:eastAsia="Consolas" w:hAnsi="Consolas"/>
-          <w:sz w:val="18"/>
-          <w:szCs w:val="18"/>
-        </w:rPr>
         <w:br/>
         <w:t xml:space="preserve">    from: &amp;AccountInfo&lt;'info&gt;,</w:t>
-      </w:r>
-      <w:r>
-        <w:rPr>
-          <w:rFonts w:ascii="Consolas" w:cs="Consolas" w:eastAsia="Consolas" w:hAnsi="Consolas"/>
-          <w:sz w:val="18"/>
-          <w:szCs w:val="18"/>
-        </w:rPr>
         <w:br/>
         <w:t xml:space="preserve">    to: &amp;AccountInfo&lt;'info&gt;,</w:t>
-      </w:r>
-      <w:r>
-        <w:rPr>
-          <w:rFonts w:ascii="Consolas" w:cs="Consolas" w:eastAsia="Consolas" w:hAnsi="Consolas"/>
-          <w:sz w:val="18"/>
-          <w:szCs w:val="18"/>
-        </w:rPr>
         <w:br/>
         <w:t xml:space="preserve">    amount: u64,</w:t>
-      </w:r>
-      <w:r>
-        <w:rPr>
-          <w:rFonts w:ascii="Consolas" w:cs="Consolas" w:eastAsia="Consolas" w:hAnsi="Consolas"/>
-          <w:sz w:val="18"/>
-          <w:szCs w:val="18"/>
-        </w:rPr>
         <w:br/>
         <w:t xml:space="preserve">) -&gt; Result&lt;()&gt; {</w:t>
-      </w:r>
-      <w:r>
-        <w:rPr>
-          <w:rFonts w:ascii="Consolas" w:cs="Consolas" w:eastAsia="Consolas" w:hAnsi="Consolas"/>
-          <w:sz w:val="18"/>
-          <w:szCs w:val="18"/>
-        </w:rPr>
         <w:br/>
         <w:t xml:space="preserve">    **from.try_borrow_mut_lamports()? = from</w:t>
-      </w:r>
-      <w:r>
-        <w:rPr>
-          <w:rFonts w:ascii="Consolas" w:cs="Consolas" w:eastAsia="Consolas" w:hAnsi="Consolas"/>
-          <w:sz w:val="18"/>
-          <w:szCs w:val="18"/>
-        </w:rPr>
         <w:br/>
         <w:t xml:space="preserve">        .lamports()</w:t>
-      </w:r>
-      <w:r>
-        <w:rPr>
-          <w:rFonts w:ascii="Consolas" w:cs="Consolas" w:eastAsia="Consolas" w:hAnsi="Consolas"/>
-          <w:sz w:val="18"/>
-          <w:szCs w:val="18"/>
-        </w:rPr>
         <w:br/>
         <w:t xml:space="preserve">        .checked_sub(amount)</w:t>
-      </w:r>
-      <w:r>
-        <w:rPr>
-          <w:rFonts w:ascii="Consolas" w:cs="Consolas" w:eastAsia="Consolas" w:hAnsi="Consolas"/>
-          <w:sz w:val="18"/>
-          <w:szCs w:val="18"/>
-        </w:rPr>
         <w:br/>
         <w:t xml:space="preserve">        .ok_or(InertiaError::Overflow)?;</w:t>
-      </w:r>
-      <w:r>
-        <w:rPr>
-          <w:rFonts w:ascii="Consolas" w:cs="Consolas" w:eastAsia="Consolas" w:hAnsi="Consolas"/>
-          <w:sz w:val="18"/>
-          <w:szCs w:val="18"/>
-        </w:rPr>
         <w:br/>
         <w:t xml:space="preserve">    **to.try_borrow_mut_lamports()? = to</w:t>
-      </w:r>
-      <w:r>
-        <w:rPr>
-          <w:rFonts w:ascii="Consolas" w:cs="Consolas" w:eastAsia="Consolas" w:hAnsi="Consolas"/>
-          <w:sz w:val="18"/>
-          <w:szCs w:val="18"/>
-        </w:rPr>
         <w:br/>
         <w:t xml:space="preserve">        .lamports()</w:t>
-      </w:r>
-      <w:r>
-        <w:rPr>
-          <w:rFonts w:ascii="Consolas" w:cs="Consolas" w:eastAsia="Consolas" w:hAnsi="Consolas"/>
-          <w:sz w:val="18"/>
-          <w:szCs w:val="18"/>
-        </w:rPr>
         <w:br/>
         <w:t xml:space="preserve">        .checked_add(amount)</w:t>
-      </w:r>
-      <w:r>
-        <w:rPr>
-          <w:rFonts w:ascii="Consolas" w:cs="Consolas" w:eastAsia="Consolas" w:hAnsi="Consolas"/>
-          <w:sz w:val="18"/>
-          <w:szCs w:val="18"/>
-        </w:rPr>
         <w:br/>
         <w:t xml:space="preserve">        .ok_or(InertiaError::Overflow)?;</w:t>
-      </w:r>
-      <w:r>
-        <w:rPr>
-          <w:rFonts w:ascii="Consolas" w:cs="Consolas" w:eastAsia="Consolas" w:hAnsi="Consolas"/>
-          <w:sz w:val="18"/>
-          <w:szCs w:val="18"/>
-        </w:rPr>
         <w:br/>
         <w:t xml:space="preserve">    Ok(())</w:t>
-      </w:r>
-      <w:r>
-        <w:rPr>
-          <w:rFonts w:ascii="Consolas" w:cs="Consolas" w:eastAsia="Consolas" w:hAnsi="Consolas"/>
-          <w:sz w:val="18"/>
-          <w:szCs w:val="18"/>
-        </w:rPr>
         <w:br/>
         <w:t xml:space="preserve">}</w:t>
       </w:r>

</xml_diff>

<commit_message>
docs: update technical report with the landing page fix and the demo
Adds the landing page proof section, the human-triggerable demo, and
the real finding behind it -- Cloudflare Workers' network is blocked by
Solana's public devnet RPC, which is why the shipped demo signs
client-side instead of through a backend.
</commit_message>
<xml_diff>
--- a/Inertia_Protocol_Technical_Report.docx
+++ b/Inertia_Protocol_Technical_Report.docx
@@ -3754,6 +3754,116 @@
     </w:p>
     <w:p>
       <w:pPr>
+        <w:pStyle w:val="Heading3"/>
+        <w:spacing w:after="120" w:before="240"/>
+      </w:pPr>
+      <w:r>
+        <w:rPr>
+          <w:b/>
+          <w:bCs/>
+        </w:rPr>
+        <w:t xml:space="preserve">12.17 Day 9, continued: the landing page actually showed none of this</w:t>
+      </w:r>
+    </w:p>
+    <w:p>
+      <w:pPr>
+        <w:spacing w:after="160" w:line="276"/>
+        <w:jc w:val="both"/>
+      </w:pPr>
+      <w:r>
+        <w:rPr>
+          <w:rFonts w:ascii="Calibri" w:cs="Calibri" w:eastAsia="Calibri" w:hAnsi="Calibri"/>
+          <w:sz w:val="22"/>
+          <w:szCs w:val="22"/>
+        </w:rPr>
+        <w:t xml:space="preserve">A direct, external review of the live site made a specific, checkable claim: the landing page showed a headline, a one-sentence description, and a single “View Docs” link — no program ID, no explorer links, no mention of the three real DEX integrations, nothing a reviewer could verify without leaving the page. That claim was checked against the actual production HTML rather than accepted or dismissed on faith, and it was correct: everything documented elsewhere in this repository was genuinely absent from the one page most visitors would actually land on first.</w:t>
+      </w:r>
+    </w:p>
+    <w:p>
+      <w:pPr>
+        <w:spacing w:after="160" w:line="276"/>
+        <w:jc w:val="both"/>
+      </w:pPr>
+      <w:r>
+        <w:rPr>
+          <w:rFonts w:ascii="Calibri" w:cs="Calibri" w:eastAsia="Calibri" w:hAnsi="Calibri"/>
+          <w:sz w:val="22"/>
+          <w:szCs w:val="22"/>
+        </w:rPr>
+        <w:t xml:space="preserve">Fixed with two additions, both verified against the live production site afterward, not just the local build: a scroll-anchored proof section below the hero (program ID linked to the explorer, a live status line, four real transaction cards — the Orca, Raydium, and Meteora rescues plus a concurrent keeper-race win — and one-click links to the integration guide, risk register, and keeper walkthrough), and, after a second round of the same review correctly noting the hero itself still showed none of it above the fold, a compact status pill inside the hero's own first viewport linking down to the full section.</w:t>
+      </w:r>
+    </w:p>
+    <w:p>
+      <w:pPr>
+        <w:pStyle w:val="Heading3"/>
+        <w:spacing w:after="120" w:before="240"/>
+      </w:pPr>
+      <w:r>
+        <w:rPr>
+          <w:b/>
+          <w:bCs/>
+        </w:rPr>
+        <w:t xml:space="preserve">12.18 Day 9, continued: a human-triggerable demo, and a real network constraint found building it</w:t>
+      </w:r>
+    </w:p>
+    <w:p>
+      <w:pPr>
+        <w:spacing w:after="160" w:line="276"/>
+        <w:jc w:val="both"/>
+      </w:pPr>
+      <w:r>
+        <w:rPr>
+          <w:rFonts w:ascii="Calibri" w:cs="Calibri" w:eastAsia="Calibri" w:hAnsi="Calibri"/>
+          <w:sz w:val="22"/>
+          <w:szCs w:val="22"/>
+        </w:rPr>
+        <w:t xml:space="preserve">Every proof up to this point was something the project's own author generated — the activity generator, the keeper bots, the demo scripts. A materially different form of evidence is a stranger causing a real rescue themselves, with their own hands, on a live site, rather than reading a claim about what already happened. That is what this feature adds: a page where a visitor's action creates a real, unexecuted escrow — the same deliberate-non-execution pattern the activity generator already uses — and the same two live keeper bots, which have no way of knowing the escrow came from a human rather than a script, discover and rescue it within seconds.</w:t>
+      </w:r>
+    </w:p>
+    <w:p>
+      <w:pPr>
+        <w:spacing w:after="160" w:line="276"/>
+        <w:jc w:val="both"/>
+      </w:pPr>
+      <w:r>
+        <w:rPr>
+          <w:rFonts w:ascii="Calibri" w:cs="Calibri" w:eastAsia="Calibri" w:hAnsi="Calibri"/>
+          <w:sz w:val="22"/>
+          <w:szCs w:val="22"/>
+        </w:rPr>
+        <w:t xml:space="preserve">The first implementation used a Cloudflare Worker holding a funded server-side signing key, so a visitor's click alone (no wallet required) would trigger the whole flow. Building it surfaced a real, previously unknown constraint, isolated methodically rather than assumed: Solana's public devnet RPC (api.devnet.solana.com) returns “Your IP or provider is blocked from this endpoint” to every request originating from Cloudflare Workers' network, regardless of request headers — confirmed by testing three different header combinations, all identically rejected, then confirmed further that the same machine's plain curl requests to the identical endpoint succeeded normally, isolating the block to Cloudflare's network specifically rather than the local environment. Two alternative free devnet RPC endpoints were checked as a possible substitute; one required its own API key, the other did not exist at the URL tried. This is not a local-development-only issue — wrangler's local dev mode routes real outbound network calls the same way production would, so the identical block would have applied to the deployed version.</w:t>
+      </w:r>
+    </w:p>
+    <w:p>
+      <w:pPr>
+        <w:spacing w:after="160" w:line="276"/>
+        <w:jc w:val="both"/>
+      </w:pPr>
+      <w:r>
+        <w:rPr>
+          <w:rFonts w:ascii="Calibri" w:cs="Calibri" w:eastAsia="Calibri" w:hAnsi="Calibri"/>
+          <w:sz w:val="22"/>
+          <w:szCs w:val="22"/>
+        </w:rPr>
+        <w:t xml:space="preserve">Rather than pay for a keyed RPC provider or move the backend to a different host, the architecture was reconsidered from the constraint outward: since Cloudflare's network, not generic cloud infrastructure, was specifically what api.devnet.solana.com blocked, a visitor's own browser — on their own network — was never actually blocked at all. The shipped version removes the server-side signing key and Worker backend entirely: the visitor connects their own Phantom wallet (set to devnet), the browser builds the same initialize_escrow transaction directly against the real IDL-derived instruction encoding, requests a devnet airdrop automatically if their balance is insufficient, and the wallet signs it. No funding wallet to protect, no rate limit to enforce against a shared resource, no server secret at all — a smaller, more honest design than the one it replaced, reached by treating a real blocker as a reason to reconsider the architecture rather than route around it with more code.</w:t>
+      </w:r>
+    </w:p>
+    <w:p>
+      <w:pPr>
+        <w:spacing w:after="160" w:line="276"/>
+        <w:jc w:val="both"/>
+      </w:pPr>
+      <w:r>
+        <w:rPr>
+          <w:rFonts w:ascii="Calibri" w:cs="Calibri" w:eastAsia="Calibri" w:hAnsi="Calibri"/>
+          <w:sz w:val="22"/>
+          <w:szCs w:val="22"/>
+        </w:rPr>
+        <w:t xml:space="preserve">Verified end to end with a real wallet, not just a clean build: a real escrow created and signed by an actual Phantom wallet, discovered and rescued by the live keepers within the expected window, both the creation and rescue transactions confirmed on-chain. The demo is live at /demo, linked from a dedicated call-to-action on the landing page itself.</w:t>
+      </w:r>
+    </w:p>
+    <w:p>
+      <w:pPr>
         <w:pStyle w:val="Heading2"/>
         <w:spacing w:after="160" w:before="320"/>
       </w:pPr>
@@ -3953,6 +4063,20 @@
           <w:szCs w:val="22"/>
         </w:rPr>
         <w:t xml:space="preserve">Keeper race safety under real concurrent competition is now proven (Section 12.14): two independently-keyed keepers racing the same live escrows produced zero double-spends and zero stuck funds across dozens of real races. Keeper race fairness has real, but not conclusive, supporting evidence — the win distribution converged toward even over a larger sample, arguing against pure determinism, but genuine keeper diversity (independent operators, varied infrastructure and latency) has not been tested, since both identities in this run shared the same machine and the same RPC connection.</w:t>
+      </w:r>
+    </w:p>
+    <w:p>
+      <w:pPr>
+        <w:spacing w:after="160" w:line="276"/>
+        <w:jc w:val="both"/>
+      </w:pPr>
+      <w:r>
+        <w:rPr>
+          <w:rFonts w:ascii="Calibri" w:cs="Calibri" w:eastAsia="Calibri" w:hAnsi="Calibri"/>
+          <w:sz w:val="22"/>
+          <w:szCs w:val="22"/>
+        </w:rPr>
+        <w:t xml:space="preserve">The human-triggerable demo (Section 12.18) narrows, without closing, the “deliberate, not organic” gap noted above: an escrow created through it is signed by a real visitor's own wallet, not generated by this project's own scripts — but the visitor is still someone directed to the site by this project, not an unprompted third-party integrator, so it is a genuinely different and stronger form of evidence than the activity generator alone, not a substitute for real organic integration.</w:t>
       </w:r>
     </w:p>
     <w:p>
@@ -14405,6 +14529,8 @@
         <w:t xml:space="preserve">├── site/                     public site + /docs, same repository,</w:t>
         <w:br/>
         <w:t xml:space="preserve">│                              deployed via Cloudflare Workers (Section 12.16)</w:t>
+        <w:br/>
+        <w:t xml:space="preserve">│   └── app/demo/            wallet-signed live demo (Section 12.18)</w:t>
         <w:br/>
         <w:t xml:space="preserve">├── README.md</w:t>
         <w:br/>

</xml_diff>